<commit_message>
feat: admin screen with users, permissions, CSV export/import and backup validation
</commit_message>
<xml_diff>
--- a/docs/Hairline Salon Manager - User Guide.docx
+++ b/docs/Hairline Salon Manager - User Guide.docx
@@ -1069,6 +1069,74 @@
                 <w:color w:val="3A362F"/>
                 <w:sz w:val="20"/>
               </w:rPr>
+              <w:t>Admin</w:t>
+            </w:r>
+          </w:p>
+        </w:tc>
+        <w:tc>
+          <w:tcPr>
+            <w:tcW w:type="dxa" w:w="5904"/>
+          </w:tcPr>
+          <w:p>
+            <w:pPr>
+              <w:spacing w:after="60" w:before="60"/>
+              <w:pBdr>
+                <w:bottom w:val="single" w:sz="4" w:space="6" w:color="EDEAE4"/>
+              </w:pBdr>
+            </w:pPr>
+            <w:r>
+              <w:rPr>
+                <w:rFonts w:ascii="Segoe UI" w:hAnsi="Segoe UI"/>
+                <w:b w:val="0"/>
+                <w:color w:val="3A362F"/>
+                <w:sz w:val="20"/>
+              </w:rPr>
+              <w:t>Users, permissions, exports and imports</w:t>
+            </w:r>
+          </w:p>
+        </w:tc>
+      </w:tr>
+      <w:tr>
+        <w:tc>
+          <w:tcPr>
+            <w:tcW w:type="dxa" w:w="576"/>
+          </w:tcPr>
+          <w:p>
+            <w:pPr>
+              <w:spacing w:after="60" w:before="60"/>
+              <w:pBdr>
+                <w:bottom w:val="single" w:sz="4" w:space="6" w:color="EDEAE4"/>
+              </w:pBdr>
+            </w:pPr>
+            <w:r>
+              <w:rPr>
+                <w:rFonts w:ascii="Segoe UI" w:hAnsi="Segoe UI"/>
+                <w:b/>
+                <w:color w:val="1A1816"/>
+                <w:sz w:val="20"/>
+              </w:rPr>
+              <w:t>11</w:t>
+            </w:r>
+          </w:p>
+        </w:tc>
+        <w:tc>
+          <w:tcPr>
+            <w:tcW w:type="dxa" w:w="2592"/>
+          </w:tcPr>
+          <w:p>
+            <w:pPr>
+              <w:spacing w:after="60" w:before="60"/>
+              <w:pBdr>
+                <w:bottom w:val="single" w:sz="4" w:space="6" w:color="EDEAE4"/>
+              </w:pBdr>
+            </w:pPr>
+            <w:r>
+              <w:rPr>
+                <w:rFonts w:ascii="Segoe UI" w:hAnsi="Segoe UI"/>
+                <w:b w:val="0"/>
+                <w:color w:val="3A362F"/>
+                <w:sz w:val="20"/>
+              </w:rPr>
               <w:t>On a phone</w:t>
             </w:r>
           </w:p>
@@ -4278,6 +4346,890 @@
           <w:color w:val="1A1816"/>
           <w:sz w:val="32"/>
         </w:rPr>
+        <w:t>Admin</w:t>
+      </w:r>
+    </w:p>
+    <w:p>
+      <w:pPr>
+        <w:spacing w:before="0" w:after="160" w:line="307" w:lineRule="auto"/>
+      </w:pPr>
+      <w:r>
+        <w:rPr>
+          <w:rFonts w:ascii="Segoe UI" w:hAnsi="Segoe UI"/>
+          <w:b w:val="0"/>
+          <w:i w:val="0"/>
+          <w:color w:val="3A362F"/>
+          <w:sz w:val="21"/>
+        </w:rPr>
+        <w:t>Everything that keeps the system tidy: who can sign in, what each role may open, and getting data in and out. The owner sees all of it; reception sees the data tabs only.</w:t>
+      </w:r>
+    </w:p>
+    <w:p>
+      <w:pPr>
+        <w:spacing w:before="180" w:after="60" w:line="307" w:lineRule="auto"/>
+      </w:pPr>
+      <w:r>
+        <w:rPr>
+          <w:rFonts w:ascii="Segoe UI" w:hAnsi="Segoe UI"/>
+          <w:b/>
+          <w:i w:val="0"/>
+          <w:color w:val="1A1816"/>
+          <w:sz w:val="23"/>
+        </w:rPr>
+        <w:t>Export data</w:t>
+      </w:r>
+    </w:p>
+    <w:p>
+      <w:pPr>
+        <w:spacing w:before="0" w:after="100" w:line="307" w:lineRule="auto"/>
+      </w:pPr>
+      <w:r>
+        <w:rPr>
+          <w:rFonts w:ascii="Segoe UI" w:hAnsi="Segoe UI"/>
+          <w:b w:val="0"/>
+          <w:i w:val="0"/>
+          <w:color w:val="3A362F"/>
+          <w:sz w:val="21"/>
+        </w:rPr>
+        <w:t>Eight ready-made exports, each a CSV that opens straight in Excel or Google Sheets. Download one, or take the lot in a single click.</w:t>
+      </w:r>
+    </w:p>
+    <w:p>
+      <w:pPr>
+        <w:spacing w:after="80" w:line="302" w:lineRule="auto"/>
+        <w:ind w:left="317"/>
+      </w:pPr>
+      <w:r>
+        <w:rPr>
+          <w:rFonts w:ascii="Segoe UI" w:hAnsi="Segoe UI"/>
+          <w:color w:val="8A7F6F"/>
+          <w:sz w:val="21"/>
+        </w:rPr>
+        <w:t xml:space="preserve">—   </w:t>
+      </w:r>
+      <w:r>
+        <w:rPr>
+          <w:rFonts w:ascii="Segoe UI" w:hAnsi="Segoe UI"/>
+          <w:color w:val="3A362F"/>
+          <w:sz w:val="21"/>
+        </w:rPr>
+        <w:t>Clients, and a separate lapsed-client list for win-back messages.</w:t>
+      </w:r>
+    </w:p>
+    <w:p>
+      <w:pPr>
+        <w:spacing w:after="80" w:line="302" w:lineRule="auto"/>
+        <w:ind w:left="317"/>
+      </w:pPr>
+      <w:r>
+        <w:rPr>
+          <w:rFonts w:ascii="Segoe UI" w:hAnsi="Segoe UI"/>
+          <w:color w:val="8A7F6F"/>
+          <w:sz w:val="21"/>
+        </w:rPr>
+        <w:t xml:space="preserve">—   </w:t>
+      </w:r>
+      <w:r>
+        <w:rPr>
+          <w:rFonts w:ascii="Segoe UI" w:hAnsi="Segoe UI"/>
+          <w:color w:val="3A362F"/>
+          <w:sz w:val="21"/>
+        </w:rPr>
+        <w:t>Sales for the day, line by line, including anything rung up on the till here.</w:t>
+      </w:r>
+    </w:p>
+    <w:p>
+      <w:pPr>
+        <w:spacing w:after="80" w:line="302" w:lineRule="auto"/>
+        <w:ind w:left="317"/>
+      </w:pPr>
+      <w:r>
+        <w:rPr>
+          <w:rFonts w:ascii="Segoe UI" w:hAnsi="Segoe UI"/>
+          <w:color w:val="8A7F6F"/>
+          <w:sz w:val="21"/>
+        </w:rPr>
+        <w:t xml:space="preserve">—   </w:t>
+      </w:r>
+      <w:r>
+        <w:rPr>
+          <w:rFonts w:ascii="Segoe UI" w:hAnsi="Segoe UI"/>
+          <w:color w:val="3A362F"/>
+          <w:sz w:val="21"/>
+        </w:rPr>
+        <w:t>Stock on hand and a what-to-order list grouped by supplier.</w:t>
+      </w:r>
+    </w:p>
+    <w:p>
+      <w:pPr>
+        <w:spacing w:after="80" w:line="302" w:lineRule="auto"/>
+        <w:ind w:left="317"/>
+      </w:pPr>
+      <w:r>
+        <w:rPr>
+          <w:rFonts w:ascii="Segoe UI" w:hAnsi="Segoe UI"/>
+          <w:color w:val="8A7F6F"/>
+          <w:sz w:val="21"/>
+        </w:rPr>
+        <w:t xml:space="preserve">—   </w:t>
+      </w:r>
+      <w:r>
+        <w:rPr>
+          <w:rFonts w:ascii="Segoe UI" w:hAnsi="Segoe UI"/>
+          <w:color w:val="3A362F"/>
+          <w:sz w:val="21"/>
+        </w:rPr>
+        <w:t>The service menu, staff performance and revenue history.</w:t>
+      </w:r>
+    </w:p>
+    <w:p>
+      <w:pPr>
+        <w:spacing w:before="160" w:after="60"/>
+        <w:jc w:val="center"/>
+      </w:pPr>
+      <w:r>
+        <w:drawing>
+          <wp:inline xmlns:a="http://schemas.openxmlformats.org/drawingml/2006/main" xmlns:pic="http://schemas.openxmlformats.org/drawingml/2006/picture">
+            <wp:extent cx="5760720" cy="3661132"/>
+            <wp:docPr id="15" name="Picture 15"/>
+            <wp:cNvGraphicFramePr>
+              <a:graphicFrameLocks noChangeAspect="1"/>
+            </wp:cNvGraphicFramePr>
+            <a:graphic>
+              <a:graphicData uri="http://schemas.openxmlformats.org/drawingml/2006/picture">
+                <pic:pic>
+                  <pic:nvPicPr>
+                    <pic:cNvPr id="0" name="18-admin-export.png"/>
+                    <pic:cNvPicPr/>
+                  </pic:nvPicPr>
+                  <pic:blipFill>
+                    <a:blip r:embed="rId23"/>
+                    <a:stretch>
+                      <a:fillRect/>
+                    </a:stretch>
+                  </pic:blipFill>
+                  <pic:spPr>
+                    <a:xfrm>
+                      <a:off x="0" y="0"/>
+                      <a:ext cx="5760720" cy="3661132"/>
+                    </a:xfrm>
+                    <a:prstGeom prst="rect"/>
+                  </pic:spPr>
+                </pic:pic>
+              </a:graphicData>
+            </a:graphic>
+          </wp:inline>
+        </w:drawing>
+      </w:r>
+    </w:p>
+    <w:p>
+      <w:pPr>
+        <w:spacing w:before="0" w:after="240" w:line="307" w:lineRule="auto"/>
+        <w:jc w:val="center"/>
+      </w:pPr>
+      <w:r>
+        <w:rPr>
+          <w:rFonts w:ascii="Segoe UI" w:hAnsi="Segoe UI"/>
+          <w:b w:val="0"/>
+          <w:i/>
+          <w:color w:val="7A7264"/>
+          <w:sz w:val="17"/>
+        </w:rPr>
+        <w:t>The export tab. Row counts are shown so you know what you are about to download.</w:t>
+      </w:r>
+    </w:p>
+    <w:p>
+      <w:pPr>
+        <w:spacing w:before="180" w:after="60" w:line="307" w:lineRule="auto"/>
+      </w:pPr>
+      <w:r>
+        <w:rPr>
+          <w:rFonts w:ascii="Segoe UI" w:hAnsi="Segoe UI"/>
+          <w:b/>
+          <w:i w:val="0"/>
+          <w:color w:val="1A1816"/>
+          <w:sz w:val="23"/>
+        </w:rPr>
+        <w:t>Load clients</w:t>
+      </w:r>
+    </w:p>
+    <w:p>
+      <w:pPr>
+        <w:spacing w:before="0" w:after="100" w:line="307" w:lineRule="auto"/>
+      </w:pPr>
+      <w:r>
+        <w:rPr>
+          <w:rFonts w:ascii="Segoe UI" w:hAnsi="Segoe UI"/>
+          <w:b w:val="0"/>
+          <w:i w:val="0"/>
+          <w:color w:val="3A362F"/>
+          <w:sz w:val="21"/>
+        </w:rPr>
+        <w:t>For bringing across a list from a spreadsheet — a promotion sign-up sheet, or clients from another salon.</w:t>
+      </w:r>
+    </w:p>
+    <w:p>
+      <w:pPr>
+        <w:spacing w:after="100" w:line="302" w:lineRule="auto"/>
+        <w:ind w:left="317"/>
+      </w:pPr>
+      <w:r>
+        <w:rPr>
+          <w:rFonts w:ascii="Segoe UI" w:hAnsi="Segoe UI"/>
+          <w:b/>
+          <w:color w:val="6E6455"/>
+          <w:sz w:val="21"/>
+        </w:rPr>
+        <w:t xml:space="preserve">1.  </w:t>
+      </w:r>
+      <w:r>
+        <w:rPr>
+          <w:rFonts w:ascii="Segoe UI" w:hAnsi="Segoe UI"/>
+          <w:b/>
+          <w:color w:val="1A1816"/>
+          <w:sz w:val="21"/>
+        </w:rPr>
+        <w:t xml:space="preserve">Download the template </w:t>
+      </w:r>
+      <w:r>
+        <w:rPr>
+          <w:rFonts w:ascii="Segoe UI" w:hAnsi="Segoe UI"/>
+          <w:color w:val="3A362F"/>
+          <w:sz w:val="21"/>
+        </w:rPr>
+        <w:t>so you can see the column names expected.</w:t>
+      </w:r>
+    </w:p>
+    <w:p>
+      <w:pPr>
+        <w:spacing w:after="100" w:line="302" w:lineRule="auto"/>
+        <w:ind w:left="317"/>
+      </w:pPr>
+      <w:r>
+        <w:rPr>
+          <w:rFonts w:ascii="Segoe UI" w:hAnsi="Segoe UI"/>
+          <w:b/>
+          <w:color w:val="6E6455"/>
+          <w:sz w:val="21"/>
+        </w:rPr>
+        <w:t xml:space="preserve">2.  </w:t>
+      </w:r>
+      <w:r>
+        <w:rPr>
+          <w:rFonts w:ascii="Segoe UI" w:hAnsi="Segoe UI"/>
+          <w:b/>
+          <w:color w:val="1A1816"/>
+          <w:sz w:val="21"/>
+        </w:rPr>
+        <w:t xml:space="preserve">Save your spreadsheet as CSV. </w:t>
+      </w:r>
+      <w:r>
+        <w:rPr>
+          <w:rFonts w:ascii="Segoe UI" w:hAnsi="Segoe UI"/>
+          <w:color w:val="3A362F"/>
+          <w:sz w:val="21"/>
+        </w:rPr>
+        <w:t>A Name column is required. Phone, Email, Birthday and Notes are used if present, and common spellings like Cell or Mobile are recognised.</w:t>
+      </w:r>
+    </w:p>
+    <w:p>
+      <w:pPr>
+        <w:spacing w:after="100" w:line="302" w:lineRule="auto"/>
+        <w:ind w:left="317"/>
+      </w:pPr>
+      <w:r>
+        <w:rPr>
+          <w:rFonts w:ascii="Segoe UI" w:hAnsi="Segoe UI"/>
+          <w:b/>
+          <w:color w:val="6E6455"/>
+          <w:sz w:val="21"/>
+        </w:rPr>
+        <w:t xml:space="preserve">3.  </w:t>
+      </w:r>
+      <w:r>
+        <w:rPr>
+          <w:rFonts w:ascii="Segoe UI" w:hAnsi="Segoe UI"/>
+          <w:b/>
+          <w:color w:val="1A1816"/>
+          <w:sz w:val="21"/>
+        </w:rPr>
+        <w:t xml:space="preserve">Choose the file. </w:t>
+      </w:r>
+      <w:r>
+        <w:rPr>
+          <w:rFonts w:ascii="Segoe UI" w:hAnsi="Segoe UI"/>
+          <w:color w:val="3A362F"/>
+          <w:sz w:val="21"/>
+        </w:rPr>
+        <w:t>Every row is checked before anything is added.</w:t>
+      </w:r>
+    </w:p>
+    <w:p>
+      <w:pPr>
+        <w:spacing w:after="100" w:line="302" w:lineRule="auto"/>
+        <w:ind w:left="317"/>
+      </w:pPr>
+      <w:r>
+        <w:rPr>
+          <w:rFonts w:ascii="Segoe UI" w:hAnsi="Segoe UI"/>
+          <w:b/>
+          <w:color w:val="6E6455"/>
+          <w:sz w:val="21"/>
+        </w:rPr>
+        <w:t xml:space="preserve">4.  </w:t>
+      </w:r>
+      <w:r>
+        <w:rPr>
+          <w:rFonts w:ascii="Segoe UI" w:hAnsi="Segoe UI"/>
+          <w:b/>
+          <w:color w:val="1A1816"/>
+          <w:sz w:val="21"/>
+        </w:rPr>
+        <w:t xml:space="preserve">Read the summary. </w:t>
+      </w:r>
+      <w:r>
+        <w:rPr>
+          <w:rFonts w:ascii="Segoe UI" w:hAnsi="Segoe UI"/>
+          <w:color w:val="3A362F"/>
+          <w:sz w:val="21"/>
+        </w:rPr>
+        <w:t>Rows with no name, an impossible phone number or a duplicate are listed and left out. Nothing is added until you press the button.</w:t>
+      </w:r>
+    </w:p>
+    <w:p>
+      <w:pPr>
+        <w:spacing w:before="160" w:after="60"/>
+        <w:jc w:val="center"/>
+      </w:pPr>
+      <w:r>
+        <w:drawing>
+          <wp:inline xmlns:a="http://schemas.openxmlformats.org/drawingml/2006/main" xmlns:pic="http://schemas.openxmlformats.org/drawingml/2006/picture">
+            <wp:extent cx="5760720" cy="3661132"/>
+            <wp:docPr id="16" name="Picture 16"/>
+            <wp:cNvGraphicFramePr>
+              <a:graphicFrameLocks noChangeAspect="1"/>
+            </wp:cNvGraphicFramePr>
+            <a:graphic>
+              <a:graphicData uri="http://schemas.openxmlformats.org/drawingml/2006/picture">
+                <pic:pic>
+                  <pic:nvPicPr>
+                    <pic:cNvPr id="0" name="19-admin-import.png"/>
+                    <pic:cNvPicPr/>
+                  </pic:nvPicPr>
+                  <pic:blipFill>
+                    <a:blip r:embed="rId24"/>
+                    <a:stretch>
+                      <a:fillRect/>
+                    </a:stretch>
+                  </pic:blipFill>
+                  <pic:spPr>
+                    <a:xfrm>
+                      <a:off x="0" y="0"/>
+                      <a:ext cx="5760720" cy="3661132"/>
+                    </a:xfrm>
+                    <a:prstGeom prst="rect"/>
+                  </pic:spPr>
+                </pic:pic>
+              </a:graphicData>
+            </a:graphic>
+          </wp:inline>
+        </w:drawing>
+      </w:r>
+    </w:p>
+    <w:p>
+      <w:pPr>
+        <w:spacing w:before="0" w:after="240" w:line="307" w:lineRule="auto"/>
+        <w:jc w:val="center"/>
+      </w:pPr>
+      <w:r>
+        <w:rPr>
+          <w:rFonts w:ascii="Segoe UI" w:hAnsi="Segoe UI"/>
+          <w:b w:val="0"/>
+          <w:i/>
+          <w:color w:val="7A7264"/>
+          <w:sz w:val="17"/>
+        </w:rPr>
+        <w:t>A file being checked: two rows ready, three skipped with the reason for each.</w:t>
+      </w:r>
+    </w:p>
+    <w:p>
+      <w:pPr>
+        <w:spacing w:before="180" w:after="60" w:line="307" w:lineRule="auto"/>
+      </w:pPr>
+      <w:r>
+        <w:rPr>
+          <w:rFonts w:ascii="Segoe UI" w:hAnsi="Segoe UI"/>
+          <w:b/>
+          <w:i w:val="0"/>
+          <w:color w:val="1A1816"/>
+          <w:sz w:val="23"/>
+        </w:rPr>
+        <w:t>MySalon backup</w:t>
+      </w:r>
+    </w:p>
+    <w:p>
+      <w:pPr>
+        <w:spacing w:before="0" w:after="100" w:line="307" w:lineRule="auto"/>
+      </w:pPr>
+      <w:r>
+        <w:rPr>
+          <w:rFonts w:ascii="Segoe UI" w:hAnsi="Segoe UI"/>
+          <w:b w:val="0"/>
+          <w:i w:val="0"/>
+          <w:color w:val="3A362F"/>
+          <w:sz w:val="21"/>
+        </w:rPr>
+        <w:t>Where a full changeover from the old system would start. Choose the .bak file MySalon produces and it is checked on the spot — the file never leaves your computer.</w:t>
+      </w:r>
+    </w:p>
+    <w:p>
+      <w:pPr>
+        <w:spacing w:after="80" w:line="302" w:lineRule="auto"/>
+        <w:ind w:left="317"/>
+      </w:pPr>
+      <w:r>
+        <w:rPr>
+          <w:rFonts w:ascii="Segoe UI" w:hAnsi="Segoe UI"/>
+          <w:color w:val="8A7F6F"/>
+          <w:sz w:val="21"/>
+        </w:rPr>
+        <w:t xml:space="preserve">—   </w:t>
+      </w:r>
+      <w:r>
+        <w:rPr>
+          <w:rFonts w:ascii="Segoe UI" w:hAnsi="Segoe UI"/>
+          <w:color w:val="3A362F"/>
+          <w:sz w:val="21"/>
+        </w:rPr>
+        <w:t>A genuine SQL Server backup is recognised by its file header and reported with its size.</w:t>
+      </w:r>
+    </w:p>
+    <w:p>
+      <w:pPr>
+        <w:spacing w:after="80" w:line="302" w:lineRule="auto"/>
+        <w:ind w:left="317"/>
+      </w:pPr>
+      <w:r>
+        <w:rPr>
+          <w:rFonts w:ascii="Segoe UI" w:hAnsi="Segoe UI"/>
+          <w:color w:val="8A7F6F"/>
+          <w:sz w:val="21"/>
+        </w:rPr>
+        <w:t xml:space="preserve">—   </w:t>
+      </w:r>
+      <w:r>
+        <w:rPr>
+          <w:rFonts w:ascii="Segoe UI" w:hAnsi="Segoe UI"/>
+          <w:color w:val="3A362F"/>
+          <w:sz w:val="21"/>
+        </w:rPr>
+        <w:t>Anything else is rejected with an explanation rather than a silent failure.</w:t>
+      </w:r>
+    </w:p>
+    <w:p>
+      <w:pPr>
+        <w:spacing w:after="80" w:line="302" w:lineRule="auto"/>
+        <w:ind w:left="317"/>
+      </w:pPr>
+      <w:r>
+        <w:rPr>
+          <w:rFonts w:ascii="Segoe UI" w:hAnsi="Segoe UI"/>
+          <w:color w:val="8A7F6F"/>
+          <w:sz w:val="21"/>
+        </w:rPr>
+        <w:t xml:space="preserve">—   </w:t>
+      </w:r>
+      <w:r>
+        <w:rPr>
+          <w:rFonts w:ascii="Segoe UI" w:hAnsi="Segoe UI"/>
+          <w:color w:val="3A362F"/>
+          <w:sz w:val="21"/>
+        </w:rPr>
+        <w:t>The five steps a real restore runs through are set out underneath.</w:t>
+      </w:r>
+    </w:p>
+    <w:p>
+      <w:pPr>
+        <w:spacing w:before="160" w:after="60"/>
+        <w:jc w:val="center"/>
+      </w:pPr>
+      <w:r>
+        <w:drawing>
+          <wp:inline xmlns:a="http://schemas.openxmlformats.org/drawingml/2006/main" xmlns:pic="http://schemas.openxmlformats.org/drawingml/2006/picture">
+            <wp:extent cx="5760720" cy="3661132"/>
+            <wp:docPr id="17" name="Picture 17"/>
+            <wp:cNvGraphicFramePr>
+              <a:graphicFrameLocks noChangeAspect="1"/>
+            </wp:cNvGraphicFramePr>
+            <a:graphic>
+              <a:graphicData uri="http://schemas.openxmlformats.org/drawingml/2006/picture">
+                <pic:pic>
+                  <pic:nvPicPr>
+                    <pic:cNvPr id="0" name="20-admin-restore.png"/>
+                    <pic:cNvPicPr/>
+                  </pic:nvPicPr>
+                  <pic:blipFill>
+                    <a:blip r:embed="rId25"/>
+                    <a:stretch>
+                      <a:fillRect/>
+                    </a:stretch>
+                  </pic:blipFill>
+                  <pic:spPr>
+                    <a:xfrm>
+                      <a:off x="0" y="0"/>
+                      <a:ext cx="5760720" cy="3661132"/>
+                    </a:xfrm>
+                    <a:prstGeom prst="rect"/>
+                  </pic:spPr>
+                </pic:pic>
+              </a:graphicData>
+            </a:graphic>
+          </wp:inline>
+        </w:drawing>
+      </w:r>
+    </w:p>
+    <w:p>
+      <w:pPr>
+        <w:spacing w:before="0" w:after="240" w:line="307" w:lineRule="auto"/>
+        <w:jc w:val="center"/>
+      </w:pPr>
+      <w:r>
+        <w:rPr>
+          <w:rFonts w:ascii="Segoe UI" w:hAnsi="Segoe UI"/>
+          <w:b w:val="0"/>
+          <w:i/>
+          <w:color w:val="7A7264"/>
+          <w:sz w:val="17"/>
+        </w:rPr>
+        <w:t>The real 141 MB MySalon backup, recognised and confirmed as valid.</w:t>
+      </w:r>
+    </w:p>
+    <w:p>
+      <w:pPr>
+        <w:spacing w:before="160" w:after="40"/>
+        <w:ind w:left="144" w:right="144"/>
+        <w:shd w:val="clear" w:fill="F7EFE0"/>
+      </w:pPr>
+      <w:r>
+        <w:rPr>
+          <w:rFonts w:ascii="Segoe UI" w:hAnsi="Segoe UI"/>
+          <w:b/>
+          <w:color w:val="A8762A"/>
+          <w:sz w:val="20"/>
+        </w:rPr>
+        <w:t xml:space="preserve">The restore itself needs a server.  </w:t>
+      </w:r>
+      <w:r>
+        <w:rPr>
+          <w:rFonts w:ascii="Segoe UI" w:hAnsi="Segoe UI"/>
+          <w:color w:val="A8762A"/>
+          <w:sz w:val="20"/>
+        </w:rPr>
+        <w:t>Checking the file works here in the browser, but restoring 148 MB of SQL Server data cannot happen in a web page. In the live system the file is handed to the server, which restores it privately, reconciles the totals and reports back. The prototype shows the steps rather than pretending to run them.</w:t>
+      </w:r>
+    </w:p>
+    <w:p>
+      <w:pPr>
+        <w:spacing w:before="180" w:after="60" w:line="307" w:lineRule="auto"/>
+      </w:pPr>
+      <w:r>
+        <w:rPr>
+          <w:rFonts w:ascii="Segoe UI" w:hAnsi="Segoe UI"/>
+          <w:b/>
+          <w:i w:val="0"/>
+          <w:color w:val="1A1816"/>
+          <w:sz w:val="23"/>
+        </w:rPr>
+        <w:t>Users</w:t>
+      </w:r>
+    </w:p>
+    <w:p>
+      <w:pPr>
+        <w:spacing w:after="80" w:line="302" w:lineRule="auto"/>
+        <w:ind w:left="317"/>
+      </w:pPr>
+      <w:r>
+        <w:rPr>
+          <w:rFonts w:ascii="Segoe UI" w:hAnsi="Segoe UI"/>
+          <w:color w:val="8A7F6F"/>
+          <w:sz w:val="21"/>
+        </w:rPr>
+        <w:t xml:space="preserve">—   </w:t>
+      </w:r>
+      <w:r>
+        <w:rPr>
+          <w:rFonts w:ascii="Segoe UI" w:hAnsi="Segoe UI"/>
+          <w:color w:val="3A362F"/>
+          <w:sz w:val="21"/>
+        </w:rPr>
+        <w:t>Add someone with a display name, username, role and password.</w:t>
+      </w:r>
+    </w:p>
+    <w:p>
+      <w:pPr>
+        <w:spacing w:after="80" w:line="302" w:lineRule="auto"/>
+        <w:ind w:left="317"/>
+      </w:pPr>
+      <w:r>
+        <w:rPr>
+          <w:rFonts w:ascii="Segoe UI" w:hAnsi="Segoe UI"/>
+          <w:color w:val="8A7F6F"/>
+          <w:sz w:val="21"/>
+        </w:rPr>
+        <w:t xml:space="preserve">—   </w:t>
+      </w:r>
+      <w:r>
+        <w:rPr>
+          <w:rFonts w:ascii="Segoe UI" w:hAnsi="Segoe UI"/>
+          <w:color w:val="3A362F"/>
+          <w:sz w:val="21"/>
+        </w:rPr>
+        <w:t>Change anyone's role from the list, or reset their password.</w:t>
+      </w:r>
+    </w:p>
+    <w:p>
+      <w:pPr>
+        <w:spacing w:after="80" w:line="302" w:lineRule="auto"/>
+        <w:ind w:left="317"/>
+      </w:pPr>
+      <w:r>
+        <w:rPr>
+          <w:rFonts w:ascii="Segoe UI" w:hAnsi="Segoe UI"/>
+          <w:color w:val="8A7F6F"/>
+          <w:sz w:val="21"/>
+        </w:rPr>
+        <w:t xml:space="preserve">—   </w:t>
+      </w:r>
+      <w:r>
+        <w:rPr>
+          <w:rFonts w:ascii="Segoe UI" w:hAnsi="Segoe UI"/>
+          <w:color w:val="3A362F"/>
+          <w:sz w:val="21"/>
+        </w:rPr>
+        <w:t>Remove a user — except the last owner, so nobody can lock the salon out.</w:t>
+      </w:r>
+    </w:p>
+    <w:p>
+      <w:pPr>
+        <w:spacing w:before="160" w:after="60"/>
+        <w:jc w:val="center"/>
+      </w:pPr>
+      <w:r>
+        <w:drawing>
+          <wp:inline xmlns:a="http://schemas.openxmlformats.org/drawingml/2006/main" xmlns:pic="http://schemas.openxmlformats.org/drawingml/2006/picture">
+            <wp:extent cx="5760720" cy="3661132"/>
+            <wp:docPr id="18" name="Picture 18"/>
+            <wp:cNvGraphicFramePr>
+              <a:graphicFrameLocks noChangeAspect="1"/>
+            </wp:cNvGraphicFramePr>
+            <a:graphic>
+              <a:graphicData uri="http://schemas.openxmlformats.org/drawingml/2006/picture">
+                <pic:pic>
+                  <pic:nvPicPr>
+                    <pic:cNvPr id="0" name="21-admin-users.png"/>
+                    <pic:cNvPicPr/>
+                  </pic:nvPicPr>
+                  <pic:blipFill>
+                    <a:blip r:embed="rId26"/>
+                    <a:stretch>
+                      <a:fillRect/>
+                    </a:stretch>
+                  </pic:blipFill>
+                  <pic:spPr>
+                    <a:xfrm>
+                      <a:off x="0" y="0"/>
+                      <a:ext cx="5760720" cy="3661132"/>
+                    </a:xfrm>
+                    <a:prstGeom prst="rect"/>
+                  </pic:spPr>
+                </pic:pic>
+              </a:graphicData>
+            </a:graphic>
+          </wp:inline>
+        </w:drawing>
+      </w:r>
+    </w:p>
+    <w:p>
+      <w:pPr>
+        <w:spacing w:before="0" w:after="240" w:line="307" w:lineRule="auto"/>
+        <w:jc w:val="center"/>
+      </w:pPr>
+      <w:r>
+        <w:rPr>
+          <w:rFonts w:ascii="Segoe UI" w:hAnsi="Segoe UI"/>
+          <w:b w:val="0"/>
+          <w:i/>
+          <w:color w:val="7A7264"/>
+          <w:sz w:val="17"/>
+        </w:rPr>
+        <w:t>The user list. Built-in demo sign-ins sit alongside anyone you add.</w:t>
+      </w:r>
+    </w:p>
+    <w:p>
+      <w:pPr>
+        <w:spacing w:before="180" w:after="60" w:line="307" w:lineRule="auto"/>
+      </w:pPr>
+      <w:r>
+        <w:rPr>
+          <w:rFonts w:ascii="Segoe UI" w:hAnsi="Segoe UI"/>
+          <w:b/>
+          <w:i w:val="0"/>
+          <w:color w:val="1A1816"/>
+          <w:sz w:val="23"/>
+        </w:rPr>
+        <w:t>Roles and screens</w:t>
+      </w:r>
+    </w:p>
+    <w:p>
+      <w:pPr>
+        <w:spacing w:before="0" w:after="100" w:line="307" w:lineRule="auto"/>
+      </w:pPr>
+      <w:r>
+        <w:rPr>
+          <w:rFonts w:ascii="Segoe UI" w:hAnsi="Segoe UI"/>
+          <w:b w:val="0"/>
+          <w:i w:val="0"/>
+          <w:color w:val="3A362F"/>
+          <w:sz w:val="21"/>
+        </w:rPr>
+        <w:t>A simple grid: tick which screens each role may open. The menu updates the instant you change something, so you can see the effect immediately.</w:t>
+      </w:r>
+    </w:p>
+    <w:p>
+      <w:pPr>
+        <w:spacing w:after="80" w:line="302" w:lineRule="auto"/>
+        <w:ind w:left="317"/>
+      </w:pPr>
+      <w:r>
+        <w:rPr>
+          <w:rFonts w:ascii="Segoe UI" w:hAnsi="Segoe UI"/>
+          <w:color w:val="8A7F6F"/>
+          <w:sz w:val="21"/>
+        </w:rPr>
+        <w:t xml:space="preserve">—   </w:t>
+      </w:r>
+      <w:r>
+        <w:rPr>
+          <w:rFonts w:ascii="Segoe UI" w:hAnsi="Segoe UI"/>
+          <w:color w:val="3A362F"/>
+          <w:sz w:val="21"/>
+        </w:rPr>
+        <w:t>Reception, for example, can be given or denied Stock without touching anything else.</w:t>
+      </w:r>
+    </w:p>
+    <w:p>
+      <w:pPr>
+        <w:spacing w:after="80" w:line="302" w:lineRule="auto"/>
+        <w:ind w:left="317"/>
+      </w:pPr>
+      <w:r>
+        <w:rPr>
+          <w:rFonts w:ascii="Segoe UI" w:hAnsi="Segoe UI"/>
+          <w:color w:val="8A7F6F"/>
+          <w:sz w:val="21"/>
+        </w:rPr>
+        <w:t xml:space="preserve">—   </w:t>
+      </w:r>
+      <w:r>
+        <w:rPr>
+          <w:rFonts w:ascii="Segoe UI" w:hAnsi="Segoe UI"/>
+          <w:color w:val="3A362F"/>
+          <w:sz w:val="21"/>
+        </w:rPr>
+        <w:t>The owner's own Admin box is fixed on, so it is impossible to lock yourself out.</w:t>
+      </w:r>
+    </w:p>
+    <w:p>
+      <w:pPr>
+        <w:spacing w:before="160" w:after="60"/>
+        <w:jc w:val="center"/>
+      </w:pPr>
+      <w:r>
+        <w:drawing>
+          <wp:inline xmlns:a="http://schemas.openxmlformats.org/drawingml/2006/main" xmlns:pic="http://schemas.openxmlformats.org/drawingml/2006/picture">
+            <wp:extent cx="5760720" cy="3661132"/>
+            <wp:docPr id="19" name="Picture 19"/>
+            <wp:cNvGraphicFramePr>
+              <a:graphicFrameLocks noChangeAspect="1"/>
+            </wp:cNvGraphicFramePr>
+            <a:graphic>
+              <a:graphicData uri="http://schemas.openxmlformats.org/drawingml/2006/picture">
+                <pic:pic>
+                  <pic:nvPicPr>
+                    <pic:cNvPr id="0" name="22-admin-permissions.png"/>
+                    <pic:cNvPicPr/>
+                  </pic:nvPicPr>
+                  <pic:blipFill>
+                    <a:blip r:embed="rId27"/>
+                    <a:stretch>
+                      <a:fillRect/>
+                    </a:stretch>
+                  </pic:blipFill>
+                  <pic:spPr>
+                    <a:xfrm>
+                      <a:off x="0" y="0"/>
+                      <a:ext cx="5760720" cy="3661132"/>
+                    </a:xfrm>
+                    <a:prstGeom prst="rect"/>
+                  </pic:spPr>
+                </pic:pic>
+              </a:graphicData>
+            </a:graphic>
+          </wp:inline>
+        </w:drawing>
+      </w:r>
+    </w:p>
+    <w:p>
+      <w:pPr>
+        <w:spacing w:before="0" w:after="240" w:line="307" w:lineRule="auto"/>
+        <w:jc w:val="center"/>
+      </w:pPr>
+      <w:r>
+        <w:rPr>
+          <w:rFonts w:ascii="Segoe UI" w:hAnsi="Segoe UI"/>
+          <w:b w:val="0"/>
+          <w:i/>
+          <w:color w:val="7A7264"/>
+          <w:sz w:val="17"/>
+        </w:rPr>
+        <w:t>The permissions grid. Owner keeps Admin permanently — that box cannot be unticked.</w:t>
+      </w:r>
+    </w:p>
+    <w:p>
+      <w:r>
+        <w:br w:type="page"/>
+      </w:r>
+    </w:p>
+    <w:p>
+      <w:pPr>
+        <w:spacing w:before="280" w:after="40" w:line="307" w:lineRule="auto"/>
+      </w:pPr>
+      <w:r>
+        <w:rPr>
+          <w:rFonts w:ascii="Segoe UI" w:hAnsi="Segoe UI"/>
+          <w:b/>
+          <w:i w:val="0"/>
+          <w:color w:val="8A7F6F"/>
+          <w:sz w:val="17"/>
+        </w:rPr>
+        <w:t>SECTION 11</w:t>
+      </w:r>
+    </w:p>
+    <w:p>
+      <w:pPr>
+        <w:spacing w:before="0" w:after="60" w:line="269" w:lineRule="auto"/>
+        <w:pBdr>
+          <w:bottom w:val="single" w:sz="6" w:space="6" w:color="E2DED7"/>
+        </w:pBdr>
+      </w:pPr>
+      <w:r>
+        <w:rPr>
+          <w:rFonts w:ascii="Segoe UI Light" w:hAnsi="Segoe UI Light"/>
+          <w:b w:val="0"/>
+          <w:i w:val="0"/>
+          <w:color w:val="1A1816"/>
+          <w:sz w:val="32"/>
+        </w:rPr>
         <w:t>On a phone</w:t>
       </w:r>
     </w:p>
@@ -4371,7 +5323,7 @@
         <w:drawing>
           <wp:inline xmlns:a="http://schemas.openxmlformats.org/drawingml/2006/main" xmlns:pic="http://schemas.openxmlformats.org/drawingml/2006/picture">
             <wp:extent cx="2286000" cy="4748696"/>
-            <wp:docPr id="15" name="Picture 15"/>
+            <wp:docPr id="20" name="Picture 20"/>
             <wp:cNvGraphicFramePr>
               <a:graphicFrameLocks noChangeAspect="1"/>
             </wp:cNvGraphicFramePr>
@@ -4383,7 +5335,7 @@
                     <pic:cNvPicPr/>
                   </pic:nvPicPr>
                   <pic:blipFill>
-                    <a:blip r:embed="rId23"/>
+                    <a:blip r:embed="rId28"/>
                     <a:stretch>
                       <a:fillRect/>
                     </a:stretch>

</xml_diff>